<commit_message>
[add] chess endgame classification
</commit_message>
<xml_diff>
--- a/Završnice_Specifikacija_racunarska_iteligencija.docx
+++ b/Završnice_Specifikacija_racunarska_iteligencija.docx
@@ -9,12 +9,28 @@
           <w:lang w:val="en-US"/>
         </w:rPr>
       </w:pPr>
+      <w:proofErr w:type="spellStart"/>
       <w:r>
         <w:rPr>
           <w:lang w:val="en-US"/>
         </w:rPr>
-        <w:t>Predlog projekta</w:t>
-      </w:r>
+        <w:t>Predlog</w:t>
+      </w:r>
+      <w:proofErr w:type="spellEnd"/>
+      <w:r>
+        <w:rPr>
+          <w:lang w:val="en-US"/>
+        </w:rPr>
+        <w:t xml:space="preserve"> </w:t>
+      </w:r>
+      <w:proofErr w:type="spellStart"/>
+      <w:r>
+        <w:rPr>
+          <w:lang w:val="en-US"/>
+        </w:rPr>
+        <w:t>projekta</w:t>
+      </w:r>
+      <w:proofErr w:type="spellEnd"/>
       <w:r>
         <w:rPr>
           <w:lang w:val="en-US"/>
@@ -29,12 +45,28 @@
           <w:lang w:val="sr-Latn-RS"/>
         </w:rPr>
       </w:pPr>
+      <w:proofErr w:type="spellStart"/>
       <w:r>
         <w:rPr>
           <w:lang w:val="en-US"/>
         </w:rPr>
-        <w:t>Osnovi ra</w:t>
-      </w:r>
+        <w:t>Osnovi</w:t>
+      </w:r>
+      <w:proofErr w:type="spellEnd"/>
+      <w:r>
+        <w:rPr>
+          <w:lang w:val="en-US"/>
+        </w:rPr>
+        <w:t xml:space="preserve"> </w:t>
+      </w:r>
+      <w:proofErr w:type="spellStart"/>
+      <w:r>
+        <w:rPr>
+          <w:lang w:val="en-US"/>
+        </w:rPr>
+        <w:t>ra</w:t>
+      </w:r>
+      <w:proofErr w:type="spellEnd"/>
       <w:r>
         <w:rPr>
           <w:lang w:val="sr-Latn-RS"/>
@@ -57,24 +89,65 @@
       </w:r>
     </w:p>
     <w:p>
+      <w:proofErr w:type="spellStart"/>
       <w:r>
         <w:t>Klasifikacija</w:t>
       </w:r>
-      <w:r>
-        <w:t xml:space="preserve"> šahovsk</w:t>
+      <w:proofErr w:type="spellEnd"/>
+      <w:r>
+        <w:t xml:space="preserve"> </w:t>
+      </w:r>
+      <w:proofErr w:type="spellStart"/>
+      <w:r>
+        <w:t>šahovsk</w:t>
       </w:r>
       <w:r>
         <w:t>ih</w:t>
       </w:r>
-      <w:r>
-        <w:t xml:space="preserve"> završnic</w:t>
+      <w:proofErr w:type="spellEnd"/>
+      <w:r>
+        <w:t xml:space="preserve"> </w:t>
+      </w:r>
+      <w:proofErr w:type="spellStart"/>
+      <w:r>
+        <w:t>završnic</w:t>
       </w:r>
       <w:r>
         <w:t>a</w:t>
       </w:r>
-      <w:r>
-        <w:t xml:space="preserve"> pomoću metoda računarske inteligencije</w:t>
-      </w:r>
+      <w:proofErr w:type="spellEnd"/>
+      <w:r>
+        <w:t xml:space="preserve"> </w:t>
+      </w:r>
+      <w:proofErr w:type="spellStart"/>
+      <w:r>
+        <w:t>pomoću</w:t>
+      </w:r>
+      <w:proofErr w:type="spellEnd"/>
+      <w:r>
+        <w:t xml:space="preserve"> </w:t>
+      </w:r>
+      <w:proofErr w:type="spellStart"/>
+      <w:r>
+        <w:t>metoda</w:t>
+      </w:r>
+      <w:proofErr w:type="spellEnd"/>
+      <w:r>
+        <w:t xml:space="preserve"> </w:t>
+      </w:r>
+      <w:proofErr w:type="spellStart"/>
+      <w:r>
+        <w:t>računarske</w:t>
+      </w:r>
+      <w:proofErr w:type="spellEnd"/>
+      <w:r>
+        <w:t xml:space="preserve"> </w:t>
+      </w:r>
+      <w:proofErr w:type="spellStart"/>
+      <w:r>
+        <w:t>inteligencije</w:t>
+      </w:r>
+      <w:proofErr w:type="spellEnd"/>
     </w:p>
     <w:p>
       <w:pPr>
@@ -92,27 +165,165 @@
     </w:p>
     <w:p>
       <w:r>
-        <w:t xml:space="preserve">Problem koji rešavamo je </w:t>
-      </w:r>
+        <w:t xml:space="preserve">Problem koji </w:t>
+      </w:r>
+      <w:proofErr w:type="spellStart"/>
+      <w:r>
+        <w:t>rešavamo</w:t>
+      </w:r>
+      <w:proofErr w:type="spellEnd"/>
+      <w:r>
+        <w:t xml:space="preserve"> je </w:t>
+      </w:r>
+      <w:proofErr w:type="spellStart"/>
       <w:r>
         <w:rPr>
           <w:b/>
           <w:bCs/>
         </w:rPr>
-        <w:t>automatsko prepoznavanje i klasifikacija šahovskih završnica</w:t>
-      </w:r>
-      <w:r>
-        <w:t xml:space="preserve">. Ulaz je šahovska pozicija u </w:t>
-      </w:r>
+        <w:t>automatsko</w:t>
+      </w:r>
+      <w:proofErr w:type="spellEnd"/>
       <w:r>
         <w:rPr>
           <w:b/>
           <w:bCs/>
         </w:rPr>
+        <w:t xml:space="preserve"> </w:t>
+      </w:r>
+      <w:proofErr w:type="spellStart"/>
+      <w:r>
+        <w:rPr>
+          <w:b/>
+          <w:bCs/>
+        </w:rPr>
+        <w:t>prepoznavanje</w:t>
+      </w:r>
+      <w:proofErr w:type="spellEnd"/>
+      <w:r>
+        <w:rPr>
+          <w:b/>
+          <w:bCs/>
+        </w:rPr>
+        <w:t xml:space="preserve"> </w:t>
+      </w:r>
+      <w:proofErr w:type="spellStart"/>
+      <w:r>
+        <w:rPr>
+          <w:b/>
+          <w:bCs/>
+        </w:rPr>
+        <w:t>i</w:t>
+      </w:r>
+      <w:proofErr w:type="spellEnd"/>
+      <w:r>
+        <w:rPr>
+          <w:b/>
+          <w:bCs/>
+        </w:rPr>
+        <w:t xml:space="preserve"> </w:t>
+      </w:r>
+      <w:proofErr w:type="spellStart"/>
+      <w:r>
+        <w:rPr>
+          <w:b/>
+          <w:bCs/>
+        </w:rPr>
+        <w:t>klasifikacija</w:t>
+      </w:r>
+      <w:proofErr w:type="spellEnd"/>
+      <w:r>
+        <w:rPr>
+          <w:b/>
+          <w:bCs/>
+        </w:rPr>
+        <w:t xml:space="preserve"> </w:t>
+      </w:r>
+      <w:proofErr w:type="spellStart"/>
+      <w:r>
+        <w:rPr>
+          <w:b/>
+          <w:bCs/>
+        </w:rPr>
+        <w:t>šahovskih</w:t>
+      </w:r>
+      <w:proofErr w:type="spellEnd"/>
+      <w:r>
+        <w:rPr>
+          <w:b/>
+          <w:bCs/>
+        </w:rPr>
+        <w:t xml:space="preserve"> </w:t>
+      </w:r>
+      <w:proofErr w:type="spellStart"/>
+      <w:r>
+        <w:rPr>
+          <w:b/>
+          <w:bCs/>
+        </w:rPr>
+        <w:t>završnica</w:t>
+      </w:r>
+      <w:proofErr w:type="spellEnd"/>
+      <w:r>
+        <w:t xml:space="preserve">. </w:t>
+      </w:r>
+      <w:proofErr w:type="spellStart"/>
+      <w:r>
+        <w:t>Ulaz</w:t>
+      </w:r>
+      <w:proofErr w:type="spellEnd"/>
+      <w:r>
+        <w:t xml:space="preserve"> je </w:t>
+      </w:r>
+      <w:proofErr w:type="spellStart"/>
+      <w:r>
+        <w:t>šahovska</w:t>
+      </w:r>
+      <w:proofErr w:type="spellEnd"/>
+      <w:r>
+        <w:t xml:space="preserve"> </w:t>
+      </w:r>
+      <w:proofErr w:type="spellStart"/>
+      <w:r>
+        <w:t>pozicija</w:t>
+      </w:r>
+      <w:proofErr w:type="spellEnd"/>
+      <w:r>
+        <w:t xml:space="preserve"> u </w:t>
+      </w:r>
+      <w:r>
+        <w:rPr>
+          <w:b/>
+          <w:bCs/>
+        </w:rPr>
         <w:t>FEN (Forsyth–Edwards Notation)</w:t>
       </w:r>
       <w:r>
-        <w:t xml:space="preserve"> formatu, a izlaz je:</w:t>
+        <w:t xml:space="preserve"> </w:t>
+      </w:r>
+      <w:proofErr w:type="spellStart"/>
+      <w:r>
+        <w:t>formatu</w:t>
+      </w:r>
+      <w:proofErr w:type="spellEnd"/>
+      <w:r>
+        <w:t xml:space="preserve">, </w:t>
+      </w:r>
+      <w:proofErr w:type="gramStart"/>
+      <w:r>
+        <w:t>a</w:t>
+      </w:r>
+      <w:proofErr w:type="gramEnd"/>
+      <w:r>
+        <w:t xml:space="preserve"> </w:t>
+      </w:r>
+      <w:proofErr w:type="spellStart"/>
+      <w:r>
+        <w:t>izlaz</w:t>
+      </w:r>
+      <w:proofErr w:type="spellEnd"/>
+      <w:r>
+        <w:t xml:space="preserve"> je:</w:t>
       </w:r>
     </w:p>
     <w:p>
@@ -123,8 +334,161 @@
           <w:numId w:val="9"/>
         </w:numPr>
       </w:pPr>
-      <w:r>
-        <w:t>klasifikacija tipa završnice (npr. „Top protiv pešaka“, „Kralj i pešak protiv kralja“, „Dva topa protiv kralja“, „Top + lovac protiv topa“),</w:t>
+      <w:proofErr w:type="spellStart"/>
+      <w:r>
+        <w:t>klasifikacija</w:t>
+      </w:r>
+      <w:proofErr w:type="spellEnd"/>
+      <w:r>
+        <w:t xml:space="preserve"> </w:t>
+      </w:r>
+      <w:proofErr w:type="spellStart"/>
+      <w:r>
+        <w:t>tipa</w:t>
+      </w:r>
+      <w:proofErr w:type="spellEnd"/>
+      <w:r>
+        <w:t xml:space="preserve"> </w:t>
+      </w:r>
+      <w:proofErr w:type="spellStart"/>
+      <w:r>
+        <w:t>završnice</w:t>
+      </w:r>
+      <w:proofErr w:type="spellEnd"/>
+      <w:r>
+        <w:t xml:space="preserve"> (</w:t>
+      </w:r>
+      <w:proofErr w:type="spellStart"/>
+      <w:r>
+        <w:t>npr</w:t>
+      </w:r>
+      <w:proofErr w:type="spellEnd"/>
+      <w:r>
+        <w:t xml:space="preserve">. „Top </w:t>
+      </w:r>
+      <w:proofErr w:type="spellStart"/>
+      <w:r>
+        <w:t>protiv</w:t>
+      </w:r>
+      <w:proofErr w:type="spellEnd"/>
+      <w:r>
+        <w:t xml:space="preserve"> </w:t>
+      </w:r>
+      <w:proofErr w:type="spellStart"/>
+      <w:proofErr w:type="gramStart"/>
+      <w:r>
+        <w:t>pešaka</w:t>
+      </w:r>
+      <w:proofErr w:type="spellEnd"/>
+      <w:r>
+        <w:t>“</w:t>
+      </w:r>
+      <w:proofErr w:type="gramEnd"/>
+      <w:r>
+        <w:t xml:space="preserve">, „Kralj </w:t>
+      </w:r>
+      <w:proofErr w:type="spellStart"/>
+      <w:r>
+        <w:t>i</w:t>
+      </w:r>
+      <w:proofErr w:type="spellEnd"/>
+      <w:r>
+        <w:t xml:space="preserve"> </w:t>
+      </w:r>
+      <w:proofErr w:type="spellStart"/>
+      <w:r>
+        <w:t>pešak</w:t>
+      </w:r>
+      <w:proofErr w:type="spellEnd"/>
+      <w:r>
+        <w:t xml:space="preserve"> </w:t>
+      </w:r>
+      <w:proofErr w:type="spellStart"/>
+      <w:r>
+        <w:t>protiv</w:t>
+      </w:r>
+      <w:proofErr w:type="spellEnd"/>
+      <w:r>
+        <w:t xml:space="preserve"> </w:t>
+      </w:r>
+      <w:proofErr w:type="spellStart"/>
+      <w:proofErr w:type="gramStart"/>
+      <w:r>
+        <w:t>kralja</w:t>
+      </w:r>
+      <w:proofErr w:type="spellEnd"/>
+      <w:r>
+        <w:t>“</w:t>
+      </w:r>
+      <w:proofErr w:type="gramEnd"/>
+      <w:r>
+        <w:t>, „</w:t>
+      </w:r>
+      <w:proofErr w:type="spellStart"/>
+      <w:r>
+        <w:t>Dva</w:t>
+      </w:r>
+      <w:proofErr w:type="spellEnd"/>
+      <w:r>
+        <w:t xml:space="preserve"> </w:t>
+      </w:r>
+      <w:proofErr w:type="spellStart"/>
+      <w:r>
+        <w:t>topa</w:t>
+      </w:r>
+      <w:proofErr w:type="spellEnd"/>
+      <w:r>
+        <w:t xml:space="preserve"> </w:t>
+      </w:r>
+      <w:proofErr w:type="spellStart"/>
+      <w:r>
+        <w:t>protiv</w:t>
+      </w:r>
+      <w:proofErr w:type="spellEnd"/>
+      <w:r>
+        <w:t xml:space="preserve"> </w:t>
+      </w:r>
+      <w:proofErr w:type="spellStart"/>
+      <w:proofErr w:type="gramStart"/>
+      <w:r>
+        <w:t>kralja</w:t>
+      </w:r>
+      <w:proofErr w:type="spellEnd"/>
+      <w:r>
+        <w:t>“</w:t>
+      </w:r>
+      <w:proofErr w:type="gramEnd"/>
+      <w:r>
+        <w:t xml:space="preserve">, „Top + </w:t>
+      </w:r>
+      <w:proofErr w:type="spellStart"/>
+      <w:r>
+        <w:t>lovac</w:t>
+      </w:r>
+      <w:proofErr w:type="spellEnd"/>
+      <w:r>
+        <w:t xml:space="preserve"> </w:t>
+      </w:r>
+      <w:proofErr w:type="spellStart"/>
+      <w:r>
+        <w:t>protiv</w:t>
+      </w:r>
+      <w:proofErr w:type="spellEnd"/>
+      <w:r>
+        <w:t xml:space="preserve"> </w:t>
+      </w:r>
+      <w:proofErr w:type="spellStart"/>
+      <w:proofErr w:type="gramStart"/>
+      <w:r>
+        <w:t>topa</w:t>
+      </w:r>
+      <w:proofErr w:type="spellEnd"/>
+      <w:r>
+        <w:t>“</w:t>
+      </w:r>
+      <w:proofErr w:type="gramEnd"/>
+      <w:r>
+        <w:t>),</w:t>
       </w:r>
     </w:p>
     <w:p>
@@ -135,13 +499,170 @@
           <w:numId w:val="9"/>
         </w:numPr>
       </w:pPr>
-      <w:r>
-        <w:t>procena verovatnoće pobede/jednakosti,</w:t>
+      <w:proofErr w:type="spellStart"/>
+      <w:r>
+        <w:t>procena</w:t>
+      </w:r>
+      <w:proofErr w:type="spellEnd"/>
+      <w:r>
+        <w:t xml:space="preserve"> </w:t>
+      </w:r>
+      <w:proofErr w:type="spellStart"/>
+      <w:r>
+        <w:t>verovatnoće</w:t>
+      </w:r>
+      <w:proofErr w:type="spellEnd"/>
+      <w:r>
+        <w:t xml:space="preserve"> </w:t>
+      </w:r>
+      <w:proofErr w:type="spellStart"/>
+      <w:r>
+        <w:t>pobede</w:t>
+      </w:r>
+      <w:proofErr w:type="spellEnd"/>
+      <w:r>
+        <w:t>/</w:t>
+      </w:r>
+      <w:proofErr w:type="spellStart"/>
+      <w:r>
+        <w:t>jednakosti</w:t>
+      </w:r>
+      <w:proofErr w:type="spellEnd"/>
+      <w:r>
+        <w:t>,</w:t>
       </w:r>
     </w:p>
     <w:p>
       <w:r>
-        <w:t>Na ovaj način sistem pomaže igraču da razume koja vrsta završnice se igra i kako bi trebalo da pristupi poziciji.</w:t>
+        <w:t xml:space="preserve">Na </w:t>
+      </w:r>
+      <w:proofErr w:type="spellStart"/>
+      <w:r>
+        <w:t>ovaj</w:t>
+      </w:r>
+      <w:proofErr w:type="spellEnd"/>
+      <w:r>
+        <w:t xml:space="preserve"> </w:t>
+      </w:r>
+      <w:proofErr w:type="spellStart"/>
+      <w:r>
+        <w:t>način</w:t>
+      </w:r>
+      <w:proofErr w:type="spellEnd"/>
+      <w:r>
+        <w:t xml:space="preserve"> </w:t>
+      </w:r>
+      <w:proofErr w:type="spellStart"/>
+      <w:r>
+        <w:t>sistem</w:t>
+      </w:r>
+      <w:proofErr w:type="spellEnd"/>
+      <w:r>
+        <w:t xml:space="preserve"> </w:t>
+      </w:r>
+      <w:proofErr w:type="spellStart"/>
+      <w:r>
+        <w:t>pomaže</w:t>
+      </w:r>
+      <w:proofErr w:type="spellEnd"/>
+      <w:r>
+        <w:t xml:space="preserve"> </w:t>
+      </w:r>
+      <w:proofErr w:type="spellStart"/>
+      <w:r>
+        <w:t>igraču</w:t>
+      </w:r>
+      <w:proofErr w:type="spellEnd"/>
+      <w:r>
+        <w:t xml:space="preserve"> da </w:t>
+      </w:r>
+      <w:proofErr w:type="spellStart"/>
+      <w:r>
+        <w:t>razume</w:t>
+      </w:r>
+      <w:proofErr w:type="spellEnd"/>
+      <w:r>
+        <w:t xml:space="preserve"> </w:t>
+      </w:r>
+      <w:proofErr w:type="spellStart"/>
+      <w:r>
+        <w:t>koja</w:t>
+      </w:r>
+      <w:proofErr w:type="spellEnd"/>
+      <w:r>
+        <w:t xml:space="preserve"> </w:t>
+      </w:r>
+      <w:proofErr w:type="spellStart"/>
+      <w:r>
+        <w:t>vrsta</w:t>
+      </w:r>
+      <w:proofErr w:type="spellEnd"/>
+      <w:r>
+        <w:t xml:space="preserve"> </w:t>
+      </w:r>
+      <w:proofErr w:type="spellStart"/>
+      <w:r>
+        <w:t>završnice</w:t>
+      </w:r>
+      <w:proofErr w:type="spellEnd"/>
+      <w:r>
+        <w:t xml:space="preserve"> se </w:t>
+      </w:r>
+      <w:proofErr w:type="spellStart"/>
+      <w:r>
+        <w:t>igra</w:t>
+      </w:r>
+      <w:proofErr w:type="spellEnd"/>
+      <w:r>
+        <w:t xml:space="preserve"> </w:t>
+      </w:r>
+      <w:proofErr w:type="spellStart"/>
+      <w:r>
+        <w:t>i</w:t>
+      </w:r>
+      <w:proofErr w:type="spellEnd"/>
+      <w:r>
+        <w:t xml:space="preserve"> </w:t>
+      </w:r>
+      <w:proofErr w:type="spellStart"/>
+      <w:r>
+        <w:t>kako</w:t>
+      </w:r>
+      <w:proofErr w:type="spellEnd"/>
+      <w:r>
+        <w:t xml:space="preserve"> </w:t>
+      </w:r>
+      <w:proofErr w:type="spellStart"/>
+      <w:r>
+        <w:t>bi</w:t>
+      </w:r>
+      <w:proofErr w:type="spellEnd"/>
+      <w:r>
+        <w:t xml:space="preserve"> </w:t>
+      </w:r>
+      <w:proofErr w:type="spellStart"/>
+      <w:r>
+        <w:t>trebalo</w:t>
+      </w:r>
+      <w:proofErr w:type="spellEnd"/>
+      <w:r>
+        <w:t xml:space="preserve"> da </w:t>
+      </w:r>
+      <w:proofErr w:type="spellStart"/>
+      <w:r>
+        <w:t>pristupi</w:t>
+      </w:r>
+      <w:proofErr w:type="spellEnd"/>
+      <w:r>
+        <w:t xml:space="preserve"> </w:t>
+      </w:r>
+      <w:proofErr w:type="spellStart"/>
+      <w:r>
+        <w:t>poziciji</w:t>
+      </w:r>
+      <w:proofErr w:type="spellEnd"/>
+      <w:r>
+        <w:t>.</w:t>
       </w:r>
     </w:p>
     <w:p>
@@ -151,8 +672,37 @@
         </w:rPr>
       </w:pPr>
       <w:r>
-        <w:t>Ova funkcionalnost predstavlja prvi segment mo</w:t>
-      </w:r>
+        <w:t xml:space="preserve">Ova </w:t>
+      </w:r>
+      <w:proofErr w:type="spellStart"/>
+      <w:r>
+        <w:t>funkcionalnost</w:t>
+      </w:r>
+      <w:proofErr w:type="spellEnd"/>
+      <w:r>
+        <w:t xml:space="preserve"> </w:t>
+      </w:r>
+      <w:proofErr w:type="spellStart"/>
+      <w:r>
+        <w:t>predstavlja</w:t>
+      </w:r>
+      <w:proofErr w:type="spellEnd"/>
+      <w:r>
+        <w:t xml:space="preserve"> </w:t>
+      </w:r>
+      <w:proofErr w:type="spellStart"/>
+      <w:r>
+        <w:t>prvi</w:t>
+      </w:r>
+      <w:proofErr w:type="spellEnd"/>
+      <w:r>
+        <w:t xml:space="preserve"> segment </w:t>
+      </w:r>
+      <w:proofErr w:type="spellStart"/>
+      <w:r>
+        <w:t>mo</w:t>
+      </w:r>
+      <w:proofErr w:type="spellEnd"/>
       <w:r>
         <w:rPr>
           <w:lang w:val="sr-Latn-RS"/>
@@ -175,22 +725,236 @@
       </w:r>
     </w:p>
     <w:p>
-      <w:r>
-        <w:t xml:space="preserve">Završnice su jedan od najtežih segmenata šaha za učenje. Iako postoje teoretske tablebase (sa potpuno tačnim rešenjima), one nisu korisnički prilagođene za igrače koji žele </w:t>
-      </w:r>
+      <w:proofErr w:type="spellStart"/>
+      <w:r>
+        <w:t>Završnice</w:t>
+      </w:r>
+      <w:proofErr w:type="spellEnd"/>
+      <w:r>
+        <w:t xml:space="preserve"> </w:t>
+      </w:r>
+      <w:proofErr w:type="spellStart"/>
+      <w:r>
+        <w:t>su</w:t>
+      </w:r>
+      <w:proofErr w:type="spellEnd"/>
+      <w:r>
+        <w:t xml:space="preserve"> </w:t>
+      </w:r>
+      <w:proofErr w:type="spellStart"/>
+      <w:r>
+        <w:t>jedan</w:t>
+      </w:r>
+      <w:proofErr w:type="spellEnd"/>
+      <w:r>
+        <w:t xml:space="preserve"> od </w:t>
+      </w:r>
+      <w:proofErr w:type="spellStart"/>
+      <w:r>
+        <w:t>najtežih</w:t>
+      </w:r>
+      <w:proofErr w:type="spellEnd"/>
+      <w:r>
+        <w:t xml:space="preserve"> </w:t>
+      </w:r>
+      <w:proofErr w:type="spellStart"/>
+      <w:r>
+        <w:t>segmenata</w:t>
+      </w:r>
+      <w:proofErr w:type="spellEnd"/>
+      <w:r>
+        <w:t xml:space="preserve"> </w:t>
+      </w:r>
+      <w:proofErr w:type="spellStart"/>
+      <w:r>
+        <w:t>šaha</w:t>
+      </w:r>
+      <w:proofErr w:type="spellEnd"/>
+      <w:r>
+        <w:t xml:space="preserve"> za </w:t>
+      </w:r>
+      <w:proofErr w:type="spellStart"/>
+      <w:r>
+        <w:t>učenje</w:t>
+      </w:r>
+      <w:proofErr w:type="spellEnd"/>
+      <w:r>
+        <w:t xml:space="preserve">. </w:t>
+      </w:r>
+      <w:proofErr w:type="spellStart"/>
+      <w:r>
+        <w:t>Iako</w:t>
+      </w:r>
+      <w:proofErr w:type="spellEnd"/>
+      <w:r>
+        <w:t xml:space="preserve"> </w:t>
+      </w:r>
+      <w:proofErr w:type="spellStart"/>
+      <w:r>
+        <w:t>postoje</w:t>
+      </w:r>
+      <w:proofErr w:type="spellEnd"/>
+      <w:r>
+        <w:t xml:space="preserve"> </w:t>
+      </w:r>
+      <w:proofErr w:type="spellStart"/>
+      <w:r>
+        <w:t>teoretske</w:t>
+      </w:r>
+      <w:proofErr w:type="spellEnd"/>
+      <w:r>
+        <w:t xml:space="preserve"> </w:t>
+      </w:r>
+      <w:proofErr w:type="spellStart"/>
+      <w:r>
+        <w:t>tablebase</w:t>
+      </w:r>
+      <w:proofErr w:type="spellEnd"/>
+      <w:r>
+        <w:t xml:space="preserve"> (</w:t>
+      </w:r>
+      <w:proofErr w:type="spellStart"/>
+      <w:r>
+        <w:t>sa</w:t>
+      </w:r>
+      <w:proofErr w:type="spellEnd"/>
+      <w:r>
+        <w:t xml:space="preserve"> </w:t>
+      </w:r>
+      <w:proofErr w:type="spellStart"/>
+      <w:r>
+        <w:t>potpuno</w:t>
+      </w:r>
+      <w:proofErr w:type="spellEnd"/>
+      <w:r>
+        <w:t xml:space="preserve"> </w:t>
+      </w:r>
+      <w:proofErr w:type="spellStart"/>
+      <w:r>
+        <w:t>tačnim</w:t>
+      </w:r>
+      <w:proofErr w:type="spellEnd"/>
+      <w:r>
+        <w:t xml:space="preserve"> </w:t>
+      </w:r>
+      <w:proofErr w:type="spellStart"/>
+      <w:r>
+        <w:t>rešenjima</w:t>
+      </w:r>
+      <w:proofErr w:type="spellEnd"/>
+      <w:r>
+        <w:t xml:space="preserve">), one </w:t>
+      </w:r>
+      <w:proofErr w:type="spellStart"/>
+      <w:r>
+        <w:t>nisu</w:t>
+      </w:r>
+      <w:proofErr w:type="spellEnd"/>
+      <w:r>
+        <w:t xml:space="preserve"> </w:t>
+      </w:r>
+      <w:proofErr w:type="spellStart"/>
+      <w:r>
+        <w:t>korisnički</w:t>
+      </w:r>
+      <w:proofErr w:type="spellEnd"/>
+      <w:r>
+        <w:t xml:space="preserve"> </w:t>
+      </w:r>
+      <w:proofErr w:type="spellStart"/>
+      <w:r>
+        <w:t>prilagođene</w:t>
+      </w:r>
+      <w:proofErr w:type="spellEnd"/>
+      <w:r>
+        <w:t xml:space="preserve"> za </w:t>
+      </w:r>
+      <w:proofErr w:type="spellStart"/>
+      <w:r>
+        <w:t>igrače</w:t>
+      </w:r>
+      <w:proofErr w:type="spellEnd"/>
+      <w:r>
+        <w:t xml:space="preserve"> koji </w:t>
+      </w:r>
+      <w:proofErr w:type="spellStart"/>
+      <w:r>
+        <w:t>žele</w:t>
+      </w:r>
+      <w:proofErr w:type="spellEnd"/>
+      <w:r>
+        <w:t xml:space="preserve"> </w:t>
+      </w:r>
+      <w:proofErr w:type="spellStart"/>
       <w:r>
         <w:rPr>
           <w:b/>
           <w:bCs/>
         </w:rPr>
-        <w:t>objašnjenje i trening</w:t>
-      </w:r>
+        <w:t>objašnjenje</w:t>
+      </w:r>
+      <w:proofErr w:type="spellEnd"/>
+      <w:r>
+        <w:rPr>
+          <w:b/>
+          <w:bCs/>
+        </w:rPr>
+        <w:t xml:space="preserve"> </w:t>
+      </w:r>
+      <w:proofErr w:type="spellStart"/>
+      <w:r>
+        <w:rPr>
+          <w:b/>
+          <w:bCs/>
+        </w:rPr>
+        <w:t>i</w:t>
+      </w:r>
+      <w:proofErr w:type="spellEnd"/>
+      <w:r>
+        <w:rPr>
+          <w:b/>
+          <w:bCs/>
+        </w:rPr>
+        <w:t xml:space="preserve"> </w:t>
+      </w:r>
+      <w:proofErr w:type="spellStart"/>
+      <w:r>
+        <w:rPr>
+          <w:b/>
+          <w:bCs/>
+        </w:rPr>
+        <w:t>trening</w:t>
+      </w:r>
+      <w:proofErr w:type="spellEnd"/>
       <w:r>
         <w:t>.</w:t>
       </w:r>
       <w:r>
         <w:br/>
-        <w:t>Praktična primena projekta:</w:t>
+      </w:r>
+      <w:proofErr w:type="spellStart"/>
+      <w:r>
+        <w:t>Praktična</w:t>
+      </w:r>
+      <w:proofErr w:type="spellEnd"/>
+      <w:r>
+        <w:t xml:space="preserve"> </w:t>
+      </w:r>
+      <w:proofErr w:type="spellStart"/>
+      <w:r>
+        <w:t>primena</w:t>
+      </w:r>
+      <w:proofErr w:type="spellEnd"/>
+      <w:r>
+        <w:t xml:space="preserve"> </w:t>
+      </w:r>
+      <w:proofErr w:type="spellStart"/>
+      <w:r>
+        <w:t>projekta</w:t>
+      </w:r>
+      <w:proofErr w:type="spellEnd"/>
+      <w:r>
+        <w:t>:</w:t>
       </w:r>
     </w:p>
     <w:p>
@@ -201,8 +965,61 @@
           <w:numId w:val="8"/>
         </w:numPr>
       </w:pPr>
-      <w:r>
-        <w:t>pomoć amaterima i klubskim igračima u vežbanju završnica,</w:t>
+      <w:proofErr w:type="spellStart"/>
+      <w:r>
+        <w:t>pomoć</w:t>
+      </w:r>
+      <w:proofErr w:type="spellEnd"/>
+      <w:r>
+        <w:t xml:space="preserve"> </w:t>
+      </w:r>
+      <w:proofErr w:type="spellStart"/>
+      <w:r>
+        <w:t>amaterima</w:t>
+      </w:r>
+      <w:proofErr w:type="spellEnd"/>
+      <w:r>
+        <w:t xml:space="preserve"> </w:t>
+      </w:r>
+      <w:proofErr w:type="spellStart"/>
+      <w:r>
+        <w:t>i</w:t>
+      </w:r>
+      <w:proofErr w:type="spellEnd"/>
+      <w:r>
+        <w:t xml:space="preserve"> </w:t>
+      </w:r>
+      <w:proofErr w:type="spellStart"/>
+      <w:r>
+        <w:t>klubskim</w:t>
+      </w:r>
+      <w:proofErr w:type="spellEnd"/>
+      <w:r>
+        <w:t xml:space="preserve"> </w:t>
+      </w:r>
+      <w:proofErr w:type="spellStart"/>
+      <w:r>
+        <w:t>igračima</w:t>
+      </w:r>
+      <w:proofErr w:type="spellEnd"/>
+      <w:r>
+        <w:t xml:space="preserve"> u </w:t>
+      </w:r>
+      <w:proofErr w:type="spellStart"/>
+      <w:r>
+        <w:t>vežbanju</w:t>
+      </w:r>
+      <w:proofErr w:type="spellEnd"/>
+      <w:r>
+        <w:t xml:space="preserve"> </w:t>
+      </w:r>
+      <w:proofErr w:type="spellStart"/>
+      <w:r>
+        <w:t>završnica</w:t>
+      </w:r>
+      <w:proofErr w:type="spellEnd"/>
+      <w:r>
+        <w:t>,</w:t>
       </w:r>
     </w:p>
     <w:p>
@@ -213,8 +1030,45 @@
           <w:numId w:val="8"/>
         </w:numPr>
       </w:pPr>
-      <w:r>
-        <w:t>edukacija u šahovskim školama i online tutorijalima,</w:t>
+      <w:proofErr w:type="spellStart"/>
+      <w:r>
+        <w:t>edukacija</w:t>
+      </w:r>
+      <w:proofErr w:type="spellEnd"/>
+      <w:r>
+        <w:t xml:space="preserve"> u </w:t>
+      </w:r>
+      <w:proofErr w:type="spellStart"/>
+      <w:r>
+        <w:t>šahovskim</w:t>
+      </w:r>
+      <w:proofErr w:type="spellEnd"/>
+      <w:r>
+        <w:t xml:space="preserve"> </w:t>
+      </w:r>
+      <w:proofErr w:type="spellStart"/>
+      <w:r>
+        <w:t>školama</w:t>
+      </w:r>
+      <w:proofErr w:type="spellEnd"/>
+      <w:r>
+        <w:t xml:space="preserve"> </w:t>
+      </w:r>
+      <w:proofErr w:type="spellStart"/>
+      <w:r>
+        <w:t>i</w:t>
+      </w:r>
+      <w:proofErr w:type="spellEnd"/>
+      <w:r>
+        <w:t xml:space="preserve"> online </w:t>
+      </w:r>
+      <w:proofErr w:type="spellStart"/>
+      <w:r>
+        <w:t>tutorijalima</w:t>
+      </w:r>
+      <w:proofErr w:type="spellEnd"/>
+      <w:r>
+        <w:t>,</w:t>
       </w:r>
     </w:p>
     <w:p>
@@ -225,23 +1079,179 @@
           <w:numId w:val="8"/>
         </w:numPr>
       </w:pPr>
-      <w:r>
-        <w:t xml:space="preserve">sistem može služiti i za </w:t>
-      </w:r>
+      <w:proofErr w:type="spellStart"/>
+      <w:r>
+        <w:t>sistem</w:t>
+      </w:r>
+      <w:proofErr w:type="spellEnd"/>
+      <w:r>
+        <w:t xml:space="preserve"> </w:t>
+      </w:r>
+      <w:proofErr w:type="spellStart"/>
+      <w:r>
+        <w:t>može</w:t>
+      </w:r>
+      <w:proofErr w:type="spellEnd"/>
+      <w:r>
+        <w:t xml:space="preserve"> </w:t>
+      </w:r>
+      <w:proofErr w:type="spellStart"/>
+      <w:r>
+        <w:t>služiti</w:t>
+      </w:r>
+      <w:proofErr w:type="spellEnd"/>
+      <w:r>
+        <w:t xml:space="preserve"> </w:t>
+      </w:r>
+      <w:proofErr w:type="spellStart"/>
+      <w:r>
+        <w:t>i</w:t>
+      </w:r>
+      <w:proofErr w:type="spellEnd"/>
+      <w:r>
+        <w:t xml:space="preserve"> za </w:t>
+      </w:r>
+      <w:proofErr w:type="spellStart"/>
       <w:r>
         <w:rPr>
           <w:b/>
           <w:bCs/>
         </w:rPr>
-        <w:t>analizu partija</w:t>
-      </w:r>
-      <w:r>
-        <w:t xml:space="preserve"> na platformama poput Lichess ili Chess.com.</w:t>
+        <w:t>analizu</w:t>
+      </w:r>
+      <w:proofErr w:type="spellEnd"/>
+      <w:r>
+        <w:rPr>
+          <w:b/>
+          <w:bCs/>
+        </w:rPr>
+        <w:t xml:space="preserve"> </w:t>
+      </w:r>
+      <w:proofErr w:type="spellStart"/>
+      <w:r>
+        <w:rPr>
+          <w:b/>
+          <w:bCs/>
+        </w:rPr>
+        <w:t>partija</w:t>
+      </w:r>
+      <w:proofErr w:type="spellEnd"/>
+      <w:r>
+        <w:t xml:space="preserve"> </w:t>
+      </w:r>
+      <w:proofErr w:type="spellStart"/>
+      <w:r>
+        <w:t>na</w:t>
+      </w:r>
+      <w:proofErr w:type="spellEnd"/>
+      <w:r>
+        <w:t xml:space="preserve"> </w:t>
+      </w:r>
+      <w:proofErr w:type="spellStart"/>
+      <w:r>
+        <w:t>platformama</w:t>
+      </w:r>
+      <w:proofErr w:type="spellEnd"/>
+      <w:r>
+        <w:t xml:space="preserve"> </w:t>
+      </w:r>
+      <w:proofErr w:type="spellStart"/>
+      <w:r>
+        <w:t>poput</w:t>
+      </w:r>
+      <w:proofErr w:type="spellEnd"/>
+      <w:r>
+        <w:t xml:space="preserve"> </w:t>
+      </w:r>
+      <w:proofErr w:type="spellStart"/>
+      <w:r>
+        <w:t>Lichess</w:t>
+      </w:r>
+      <w:proofErr w:type="spellEnd"/>
+      <w:r>
+        <w:t xml:space="preserve"> </w:t>
+      </w:r>
+      <w:proofErr w:type="spellStart"/>
+      <w:r>
+        <w:t>ili</w:t>
+      </w:r>
+      <w:proofErr w:type="spellEnd"/>
+      <w:r>
+        <w:t xml:space="preserve"> Chess.com.</w:t>
       </w:r>
     </w:p>
     <w:p>
-      <w:r>
-        <w:t>Dakle, vrednost je edukativna i trenažna, a ne samo puko izračunavanje.</w:t>
+      <w:proofErr w:type="spellStart"/>
+      <w:r>
+        <w:t>Dakle</w:t>
+      </w:r>
+      <w:proofErr w:type="spellEnd"/>
+      <w:r>
+        <w:t xml:space="preserve">, </w:t>
+      </w:r>
+      <w:proofErr w:type="spellStart"/>
+      <w:r>
+        <w:t>vrednost</w:t>
+      </w:r>
+      <w:proofErr w:type="spellEnd"/>
+      <w:r>
+        <w:t xml:space="preserve"> je </w:t>
+      </w:r>
+      <w:proofErr w:type="spellStart"/>
+      <w:r>
+        <w:t>edukativna</w:t>
+      </w:r>
+      <w:proofErr w:type="spellEnd"/>
+      <w:r>
+        <w:t xml:space="preserve"> </w:t>
+      </w:r>
+      <w:proofErr w:type="spellStart"/>
+      <w:r>
+        <w:t>i</w:t>
+      </w:r>
+      <w:proofErr w:type="spellEnd"/>
+      <w:r>
+        <w:t xml:space="preserve"> </w:t>
+      </w:r>
+      <w:proofErr w:type="spellStart"/>
+      <w:r>
+        <w:t>trenažna</w:t>
+      </w:r>
+      <w:proofErr w:type="spellEnd"/>
+      <w:r>
+        <w:t xml:space="preserve">, a </w:t>
+      </w:r>
+      <w:proofErr w:type="spellStart"/>
+      <w:r>
+        <w:t>ne</w:t>
+      </w:r>
+      <w:proofErr w:type="spellEnd"/>
+      <w:r>
+        <w:t xml:space="preserve"> </w:t>
+      </w:r>
+      <w:proofErr w:type="spellStart"/>
+      <w:r>
+        <w:t>samo</w:t>
+      </w:r>
+      <w:proofErr w:type="spellEnd"/>
+      <w:r>
+        <w:t xml:space="preserve"> </w:t>
+      </w:r>
+      <w:proofErr w:type="spellStart"/>
+      <w:r>
+        <w:t>puko</w:t>
+      </w:r>
+      <w:proofErr w:type="spellEnd"/>
+      <w:r>
+        <w:t xml:space="preserve"> </w:t>
+      </w:r>
+      <w:proofErr w:type="spellStart"/>
+      <w:r>
+        <w:t>izračunavanje</w:t>
+      </w:r>
+      <w:proofErr w:type="spellEnd"/>
+      <w:r>
+        <w:t>.</w:t>
       </w:r>
     </w:p>
     <w:p>
@@ -259,15 +1269,29 @@
       </w:r>
     </w:p>
     <w:p>
-      <w:r>
-        <w:t xml:space="preserve">Koristićemo </w:t>
-      </w:r>
+      <w:proofErr w:type="spellStart"/>
+      <w:r>
+        <w:t>Koristićemo</w:t>
+      </w:r>
+      <w:proofErr w:type="spellEnd"/>
+      <w:r>
+        <w:t xml:space="preserve"> </w:t>
+      </w:r>
+      <w:proofErr w:type="spellStart"/>
       <w:r>
         <w:rPr>
           <w:b/>
           <w:bCs/>
         </w:rPr>
-        <w:t>Lichess open database</w:t>
+        <w:t>Lichess</w:t>
+      </w:r>
+      <w:proofErr w:type="spellEnd"/>
+      <w:r>
+        <w:rPr>
+          <w:b/>
+          <w:bCs/>
+        </w:rPr>
+        <w:t xml:space="preserve"> open database</w:t>
       </w:r>
       <w:r>
         <w:t xml:space="preserve"> (</w:t>
@@ -281,21 +1305,93 @@
         </w:r>
       </w:hyperlink>
       <w:r>
-        <w:t>), koja sadrži milione partija u PGN formatu.</w:t>
+        <w:t xml:space="preserve">), </w:t>
+      </w:r>
+      <w:proofErr w:type="spellStart"/>
+      <w:r>
+        <w:t>koja</w:t>
+      </w:r>
+      <w:proofErr w:type="spellEnd"/>
+      <w:r>
+        <w:t xml:space="preserve"> </w:t>
+      </w:r>
+      <w:proofErr w:type="spellStart"/>
+      <w:r>
+        <w:t>sadrži</w:t>
+      </w:r>
+      <w:proofErr w:type="spellEnd"/>
+      <w:r>
+        <w:t xml:space="preserve"> </w:t>
+      </w:r>
+      <w:proofErr w:type="spellStart"/>
+      <w:r>
+        <w:t>milione</w:t>
+      </w:r>
+      <w:proofErr w:type="spellEnd"/>
+      <w:r>
+        <w:t xml:space="preserve"> </w:t>
+      </w:r>
+      <w:proofErr w:type="spellStart"/>
+      <w:r>
+        <w:t>partija</w:t>
+      </w:r>
+      <w:proofErr w:type="spellEnd"/>
+      <w:r>
+        <w:t xml:space="preserve"> u PGN </w:t>
+      </w:r>
+      <w:proofErr w:type="spellStart"/>
+      <w:r>
+        <w:t>formatu</w:t>
+      </w:r>
+      <w:proofErr w:type="spellEnd"/>
+      <w:r>
+        <w:t>.</w:t>
       </w:r>
       <w:r>
         <w:br/>
-        <w:t xml:space="preserve">Takođe, postoje </w:t>
+      </w:r>
+      <w:proofErr w:type="spellStart"/>
+      <w:r>
+        <w:t>Takođe</w:t>
+      </w:r>
+      <w:proofErr w:type="spellEnd"/>
+      <w:r>
+        <w:t xml:space="preserve">, </w:t>
+      </w:r>
+      <w:proofErr w:type="spellStart"/>
+      <w:r>
+        <w:t>postoje</w:t>
+      </w:r>
+      <w:proofErr w:type="spellEnd"/>
+      <w:r>
+        <w:t xml:space="preserve"> </w:t>
       </w:r>
       <w:r>
         <w:rPr>
           <w:b/>
           <w:bCs/>
         </w:rPr>
-        <w:t>endgame tablebases</w:t>
-      </w:r>
-      <w:r>
-        <w:t xml:space="preserve"> (npr. Syzygy, </w:t>
+        <w:t xml:space="preserve">endgame </w:t>
+      </w:r>
+      <w:proofErr w:type="spellStart"/>
+      <w:r>
+        <w:rPr>
+          <w:b/>
+          <w:bCs/>
+        </w:rPr>
+        <w:t>tablebases</w:t>
+      </w:r>
+      <w:proofErr w:type="spellEnd"/>
+      <w:r>
+        <w:t xml:space="preserve"> (</w:t>
+      </w:r>
+      <w:proofErr w:type="spellStart"/>
+      <w:r>
+        <w:t>npr</w:t>
+      </w:r>
+      <w:proofErr w:type="spellEnd"/>
+      <w:r>
+        <w:t xml:space="preserve">. Syzygy, </w:t>
       </w:r>
       <w:hyperlink r:id="rId6" w:history="1">
         <w:r>
@@ -306,7 +1402,47 @@
         </w:r>
       </w:hyperlink>
       <w:r>
-        <w:t>) sa pozicijama i tačnim ishodima.</w:t>
+        <w:t xml:space="preserve">) </w:t>
+      </w:r>
+      <w:proofErr w:type="spellStart"/>
+      <w:r>
+        <w:t>sa</w:t>
+      </w:r>
+      <w:proofErr w:type="spellEnd"/>
+      <w:r>
+        <w:t xml:space="preserve"> </w:t>
+      </w:r>
+      <w:proofErr w:type="spellStart"/>
+      <w:r>
+        <w:t>pozicijama</w:t>
+      </w:r>
+      <w:proofErr w:type="spellEnd"/>
+      <w:r>
+        <w:t xml:space="preserve"> </w:t>
+      </w:r>
+      <w:proofErr w:type="spellStart"/>
+      <w:r>
+        <w:t>i</w:t>
+      </w:r>
+      <w:proofErr w:type="spellEnd"/>
+      <w:r>
+        <w:t xml:space="preserve"> </w:t>
+      </w:r>
+      <w:proofErr w:type="spellStart"/>
+      <w:r>
+        <w:t>tačnim</w:t>
+      </w:r>
+      <w:proofErr w:type="spellEnd"/>
+      <w:r>
+        <w:t xml:space="preserve"> </w:t>
+      </w:r>
+      <w:proofErr w:type="spellStart"/>
+      <w:r>
+        <w:t>ishodima</w:t>
+      </w:r>
+      <w:proofErr w:type="spellEnd"/>
+      <w:r>
+        <w:t>.</w:t>
       </w:r>
     </w:p>
     <w:p>
@@ -322,8 +1458,67 @@
           <w:numId w:val="7"/>
         </w:numPr>
       </w:pPr>
-      <w:r>
-        <w:t>izdvojiti samo završnice (pozicije gde je ostalo ≤ 6 figura),</w:t>
+      <w:proofErr w:type="spellStart"/>
+      <w:r>
+        <w:t>izdvojiti</w:t>
+      </w:r>
+      <w:proofErr w:type="spellEnd"/>
+      <w:r>
+        <w:t xml:space="preserve"> </w:t>
+      </w:r>
+      <w:proofErr w:type="spellStart"/>
+      <w:r>
+        <w:t>samo</w:t>
+      </w:r>
+      <w:proofErr w:type="spellEnd"/>
+      <w:r>
+        <w:t xml:space="preserve"> </w:t>
+      </w:r>
+      <w:proofErr w:type="spellStart"/>
+      <w:r>
+        <w:t>završnice</w:t>
+      </w:r>
+      <w:proofErr w:type="spellEnd"/>
+      <w:r>
+        <w:t xml:space="preserve"> (</w:t>
+      </w:r>
+      <w:proofErr w:type="spellStart"/>
+      <w:r>
+        <w:t>pozicije</w:t>
+      </w:r>
+      <w:proofErr w:type="spellEnd"/>
+      <w:r>
+        <w:t xml:space="preserve"> </w:t>
+      </w:r>
+      <w:proofErr w:type="spellStart"/>
+      <w:r>
+        <w:t>gde</w:t>
+      </w:r>
+      <w:proofErr w:type="spellEnd"/>
+      <w:r>
+        <w:t xml:space="preserve"> je </w:t>
+      </w:r>
+      <w:proofErr w:type="spellStart"/>
+      <w:r>
+        <w:t>ostalo</w:t>
+      </w:r>
+      <w:proofErr w:type="spellEnd"/>
+      <w:r>
+        <w:t xml:space="preserve"> </w:t>
+      </w:r>
+      <w:r>
+        <w:t>&lt;</w:t>
+      </w:r>
+      <w:r>
+        <w:t xml:space="preserve"> 6 </w:t>
+      </w:r>
+      <w:proofErr w:type="spellStart"/>
+      <w:r>
+        <w:t>figura</w:t>
+      </w:r>
+      <w:proofErr w:type="spellEnd"/>
+      <w:r>
+        <w:t>),</w:t>
       </w:r>
     </w:p>
     <w:p>
@@ -334,9 +1529,14 @@
           <w:numId w:val="7"/>
         </w:numPr>
       </w:pPr>
+      <w:proofErr w:type="spellStart"/>
       <w:r>
         <w:lastRenderedPageBreak/>
-        <w:t xml:space="preserve">konvertovati u </w:t>
+        <w:t>konvertovati</w:t>
+      </w:r>
+      <w:proofErr w:type="spellEnd"/>
+      <w:r>
+        <w:t xml:space="preserve"> u </w:t>
       </w:r>
       <w:r>
         <w:rPr>
@@ -357,13 +1557,95 @@
           <w:numId w:val="7"/>
         </w:numPr>
       </w:pPr>
-      <w:r>
-        <w:t>anotirati tip završnice i ishod (pobeda belog, pobeda crnog, remi).</w:t>
+      <w:proofErr w:type="spellStart"/>
+      <w:r>
+        <w:t>anotirati</w:t>
+      </w:r>
+      <w:proofErr w:type="spellEnd"/>
+      <w:r>
+        <w:t xml:space="preserve"> tip </w:t>
+      </w:r>
+      <w:proofErr w:type="spellStart"/>
+      <w:r>
+        <w:t>završnice</w:t>
+      </w:r>
+      <w:proofErr w:type="spellEnd"/>
+      <w:r>
+        <w:t xml:space="preserve"> </w:t>
+      </w:r>
+      <w:proofErr w:type="spellStart"/>
+      <w:r>
+        <w:t>i</w:t>
+      </w:r>
+      <w:proofErr w:type="spellEnd"/>
+      <w:r>
+        <w:t xml:space="preserve"> </w:t>
+      </w:r>
+      <w:proofErr w:type="spellStart"/>
+      <w:r>
+        <w:t>ishod</w:t>
+      </w:r>
+      <w:proofErr w:type="spellEnd"/>
+      <w:r>
+        <w:t xml:space="preserve"> (</w:t>
+      </w:r>
+      <w:proofErr w:type="spellStart"/>
+      <w:r>
+        <w:t>pobeda</w:t>
+      </w:r>
+      <w:proofErr w:type="spellEnd"/>
+      <w:r>
+        <w:t xml:space="preserve"> </w:t>
+      </w:r>
+      <w:proofErr w:type="spellStart"/>
+      <w:r>
+        <w:t>belog</w:t>
+      </w:r>
+      <w:proofErr w:type="spellEnd"/>
+      <w:r>
+        <w:t xml:space="preserve">, </w:t>
+      </w:r>
+      <w:proofErr w:type="spellStart"/>
+      <w:r>
+        <w:t>pobeda</w:t>
+      </w:r>
+      <w:proofErr w:type="spellEnd"/>
+      <w:r>
+        <w:t xml:space="preserve"> </w:t>
+      </w:r>
+      <w:proofErr w:type="spellStart"/>
+      <w:r>
+        <w:t>crnog</w:t>
+      </w:r>
+      <w:proofErr w:type="spellEnd"/>
+      <w:r>
+        <w:t xml:space="preserve">, </w:t>
+      </w:r>
+      <w:proofErr w:type="spellStart"/>
+      <w:r>
+        <w:t>remi</w:t>
+      </w:r>
+      <w:proofErr w:type="spellEnd"/>
+      <w:r>
+        <w:t>).</w:t>
       </w:r>
     </w:p>
     <w:p>
-      <w:r>
-        <w:t>Očekivani obim:</w:t>
+      <w:proofErr w:type="spellStart"/>
+      <w:r>
+        <w:t>Očekivani</w:t>
+      </w:r>
+      <w:proofErr w:type="spellEnd"/>
+      <w:r>
+        <w:t xml:space="preserve"> </w:t>
+      </w:r>
+      <w:proofErr w:type="spellStart"/>
+      <w:r>
+        <w:t>obim</w:t>
+      </w:r>
+      <w:proofErr w:type="spellEnd"/>
+      <w:r>
+        <w:t>:</w:t>
       </w:r>
     </w:p>
     <w:p>
@@ -375,7 +1657,23 @@
         </w:numPr>
       </w:pPr>
       <w:r>
-        <w:t>~200.000 instanci završnica,</w:t>
+        <w:t xml:space="preserve">~200.000 </w:t>
+      </w:r>
+      <w:proofErr w:type="spellStart"/>
+      <w:r>
+        <w:t>instanci</w:t>
+      </w:r>
+      <w:proofErr w:type="spellEnd"/>
+      <w:r>
+        <w:t xml:space="preserve"> </w:t>
+      </w:r>
+      <w:proofErr w:type="spellStart"/>
+      <w:r>
+        <w:t>završnica</w:t>
+      </w:r>
+      <w:proofErr w:type="spellEnd"/>
+      <w:r>
+        <w:t>,</w:t>
       </w:r>
     </w:p>
     <w:p>
@@ -386,8 +1684,85 @@
           <w:numId w:val="6"/>
         </w:numPr>
       </w:pPr>
-      <w:r>
-        <w:t>atributi: pozicija (FEN string), broj figura, tip završnice, na potezu beli/crni, ishod.</w:t>
+      <w:proofErr w:type="spellStart"/>
+      <w:r>
+        <w:t>atributi</w:t>
+      </w:r>
+      <w:proofErr w:type="spellEnd"/>
+      <w:r>
+        <w:t xml:space="preserve">: </w:t>
+      </w:r>
+      <w:proofErr w:type="spellStart"/>
+      <w:r>
+        <w:t>pozicija</w:t>
+      </w:r>
+      <w:proofErr w:type="spellEnd"/>
+      <w:r>
+        <w:t xml:space="preserve"> (FEN string), </w:t>
+      </w:r>
+      <w:proofErr w:type="spellStart"/>
+      <w:r>
+        <w:t>broj</w:t>
+      </w:r>
+      <w:proofErr w:type="spellEnd"/>
+      <w:r>
+        <w:t xml:space="preserve"> </w:t>
+      </w:r>
+      <w:proofErr w:type="spellStart"/>
+      <w:r>
+        <w:t>figura</w:t>
+      </w:r>
+      <w:proofErr w:type="spellEnd"/>
+      <w:r>
+        <w:t xml:space="preserve">, tip </w:t>
+      </w:r>
+      <w:proofErr w:type="spellStart"/>
+      <w:r>
+        <w:t>završnice</w:t>
+      </w:r>
+      <w:proofErr w:type="spellEnd"/>
+      <w:r>
+        <w:t xml:space="preserve">, </w:t>
+      </w:r>
+      <w:proofErr w:type="spellStart"/>
+      <w:r>
+        <w:t>na</w:t>
+      </w:r>
+      <w:proofErr w:type="spellEnd"/>
+      <w:r>
+        <w:t xml:space="preserve"> </w:t>
+      </w:r>
+      <w:proofErr w:type="spellStart"/>
+      <w:r>
+        <w:t>potezu</w:t>
+      </w:r>
+      <w:proofErr w:type="spellEnd"/>
+      <w:r>
+        <w:t xml:space="preserve"> </w:t>
+      </w:r>
+      <w:proofErr w:type="spellStart"/>
+      <w:r>
+        <w:t>beli</w:t>
+      </w:r>
+      <w:proofErr w:type="spellEnd"/>
+      <w:r>
+        <w:t>/</w:t>
+      </w:r>
+      <w:proofErr w:type="spellStart"/>
+      <w:r>
+        <w:t>crni</w:t>
+      </w:r>
+      <w:proofErr w:type="spellEnd"/>
+      <w:r>
+        <w:t xml:space="preserve">, </w:t>
+      </w:r>
+      <w:proofErr w:type="spellStart"/>
+      <w:r>
+        <w:t>ishod</w:t>
+      </w:r>
+      <w:proofErr w:type="spellEnd"/>
+      <w:r>
+        <w:t>.</w:t>
       </w:r>
     </w:p>
     <w:p>
@@ -398,18 +1773,97 @@
           <w:numId w:val="6"/>
         </w:numPr>
       </w:pPr>
-      <w:r>
-        <w:t xml:space="preserve">Ciljno obeležje: </w:t>
-      </w:r>
+      <w:proofErr w:type="spellStart"/>
+      <w:r>
+        <w:t>Ciljno</w:t>
+      </w:r>
+      <w:proofErr w:type="spellEnd"/>
+      <w:r>
+        <w:t xml:space="preserve"> </w:t>
+      </w:r>
+      <w:proofErr w:type="spellStart"/>
+      <w:r>
+        <w:t>obeležje</w:t>
+      </w:r>
+      <w:proofErr w:type="spellEnd"/>
+      <w:r>
+        <w:t xml:space="preserve">: </w:t>
+      </w:r>
+      <w:proofErr w:type="spellStart"/>
       <w:r>
         <w:rPr>
           <w:b/>
           <w:bCs/>
         </w:rPr>
-        <w:t>ishod partije</w:t>
-      </w:r>
-      <w:r>
-        <w:t xml:space="preserve"> (klasifikacija: pobeda belog / remi / pobeda crnog).</w:t>
+        <w:t>ishod</w:t>
+      </w:r>
+      <w:proofErr w:type="spellEnd"/>
+      <w:r>
+        <w:rPr>
+          <w:b/>
+          <w:bCs/>
+        </w:rPr>
+        <w:t xml:space="preserve"> </w:t>
+      </w:r>
+      <w:proofErr w:type="spellStart"/>
+      <w:r>
+        <w:rPr>
+          <w:b/>
+          <w:bCs/>
+        </w:rPr>
+        <w:t>partije</w:t>
+      </w:r>
+      <w:proofErr w:type="spellEnd"/>
+      <w:r>
+        <w:t xml:space="preserve"> (</w:t>
+      </w:r>
+      <w:proofErr w:type="spellStart"/>
+      <w:r>
+        <w:t>klasifikacija</w:t>
+      </w:r>
+      <w:proofErr w:type="spellEnd"/>
+      <w:r>
+        <w:t xml:space="preserve">: </w:t>
+      </w:r>
+      <w:proofErr w:type="spellStart"/>
+      <w:r>
+        <w:t>pobeda</w:t>
+      </w:r>
+      <w:proofErr w:type="spellEnd"/>
+      <w:r>
+        <w:t xml:space="preserve"> </w:t>
+      </w:r>
+      <w:proofErr w:type="spellStart"/>
+      <w:r>
+        <w:t>belog</w:t>
+      </w:r>
+      <w:proofErr w:type="spellEnd"/>
+      <w:r>
+        <w:t xml:space="preserve"> / </w:t>
+      </w:r>
+      <w:proofErr w:type="spellStart"/>
+      <w:r>
+        <w:t>remi</w:t>
+      </w:r>
+      <w:proofErr w:type="spellEnd"/>
+      <w:r>
+        <w:t xml:space="preserve"> / </w:t>
+      </w:r>
+      <w:proofErr w:type="spellStart"/>
+      <w:r>
+        <w:t>pobeda</w:t>
+      </w:r>
+      <w:proofErr w:type="spellEnd"/>
+      <w:r>
+        <w:t xml:space="preserve"> </w:t>
+      </w:r>
+      <w:proofErr w:type="spellStart"/>
+      <w:r>
+        <w:t>crnog</w:t>
+      </w:r>
+      <w:proofErr w:type="spellEnd"/>
+      <w:r>
+        <w:t>).</w:t>
       </w:r>
     </w:p>
     <w:p>
@@ -434,8 +1888,21 @@
           <w:numId w:val="4"/>
         </w:numPr>
       </w:pPr>
-      <w:r>
-        <w:t>Parsiranje PGN fajlova u FEN format,</w:t>
+      <w:proofErr w:type="spellStart"/>
+      <w:r>
+        <w:t>Parsiranje</w:t>
+      </w:r>
+      <w:proofErr w:type="spellEnd"/>
+      <w:r>
+        <w:t xml:space="preserve"> PGN </w:t>
+      </w:r>
+      <w:proofErr w:type="spellStart"/>
+      <w:r>
+        <w:t>fajlova</w:t>
+      </w:r>
+      <w:proofErr w:type="spellEnd"/>
+      <w:r>
+        <w:t xml:space="preserve"> u FEN format,</w:t>
       </w:r>
     </w:p>
     <w:p>
@@ -446,14 +1913,43 @@
           <w:numId w:val="4"/>
         </w:numPr>
       </w:pPr>
-      <w:r>
-        <w:t xml:space="preserve">Filtriranje pozicija sa </w:t>
+      <w:proofErr w:type="spellStart"/>
+      <w:r>
+        <w:t>Filtriranje</w:t>
+      </w:r>
+      <w:proofErr w:type="spellEnd"/>
+      <w:r>
+        <w:t xml:space="preserve"> </w:t>
+      </w:r>
+      <w:proofErr w:type="spellStart"/>
+      <w:r>
+        <w:t>pozicija</w:t>
+      </w:r>
+      <w:proofErr w:type="spellEnd"/>
+      <w:r>
+        <w:t xml:space="preserve"> </w:t>
+      </w:r>
+      <w:proofErr w:type="spellStart"/>
+      <w:r>
+        <w:t>sa</w:t>
+      </w:r>
+      <w:proofErr w:type="spellEnd"/>
+      <w:r>
+        <w:t xml:space="preserve"> </w:t>
       </w:r>
       <w:r>
         <w:t>&lt;</w:t>
       </w:r>
       <w:r>
-        <w:t xml:space="preserve"> 6 figura,</w:t>
+        <w:t xml:space="preserve"> 6 </w:t>
+      </w:r>
+      <w:proofErr w:type="spellStart"/>
+      <w:r>
+        <w:t>figura</w:t>
+      </w:r>
+      <w:proofErr w:type="spellEnd"/>
+      <w:r>
+        <w:t>,</w:t>
       </w:r>
     </w:p>
     <w:p>
@@ -464,8 +1960,69 @@
           <w:numId w:val="4"/>
         </w:numPr>
       </w:pPr>
-      <w:r>
-        <w:t>Normalizacija (bele figure uvek na dnu table, rotacija radi uniformnosti),</w:t>
+      <w:proofErr w:type="spellStart"/>
+      <w:r>
+        <w:t>Normalizacija</w:t>
+      </w:r>
+      <w:proofErr w:type="spellEnd"/>
+      <w:r>
+        <w:t xml:space="preserve"> (</w:t>
+      </w:r>
+      <w:proofErr w:type="spellStart"/>
+      <w:r>
+        <w:t>bele</w:t>
+      </w:r>
+      <w:proofErr w:type="spellEnd"/>
+      <w:r>
+        <w:t xml:space="preserve"> figure </w:t>
+      </w:r>
+      <w:proofErr w:type="spellStart"/>
+      <w:r>
+        <w:t>uvek</w:t>
+      </w:r>
+      <w:proofErr w:type="spellEnd"/>
+      <w:r>
+        <w:t xml:space="preserve"> </w:t>
+      </w:r>
+      <w:proofErr w:type="spellStart"/>
+      <w:r>
+        <w:t>na</w:t>
+      </w:r>
+      <w:proofErr w:type="spellEnd"/>
+      <w:r>
+        <w:t xml:space="preserve"> </w:t>
+      </w:r>
+      <w:proofErr w:type="spellStart"/>
+      <w:r>
+        <w:t>dnu</w:t>
+      </w:r>
+      <w:proofErr w:type="spellEnd"/>
+      <w:r>
+        <w:t xml:space="preserve"> table, </w:t>
+      </w:r>
+      <w:proofErr w:type="spellStart"/>
+      <w:r>
+        <w:t>rotacija</w:t>
+      </w:r>
+      <w:proofErr w:type="spellEnd"/>
+      <w:r>
+        <w:t xml:space="preserve"> </w:t>
+      </w:r>
+      <w:proofErr w:type="spellStart"/>
+      <w:r>
+        <w:t>radi</w:t>
+      </w:r>
+      <w:proofErr w:type="spellEnd"/>
+      <w:r>
+        <w:t xml:space="preserve"> </w:t>
+      </w:r>
+      <w:proofErr w:type="spellStart"/>
+      <w:r>
+        <w:t>uniformnosti</w:t>
+      </w:r>
+      <w:proofErr w:type="spellEnd"/>
+      <w:r>
+        <w:t>),</w:t>
       </w:r>
     </w:p>
     <w:p>
@@ -476,8 +2033,61 @@
           <w:numId w:val="4"/>
         </w:numPr>
       </w:pPr>
-      <w:r>
-        <w:t>Balansiranje klasa (jer remiji dominiraju u nekim završnicama),</w:t>
+      <w:proofErr w:type="spellStart"/>
+      <w:r>
+        <w:t>Balansiranje</w:t>
+      </w:r>
+      <w:proofErr w:type="spellEnd"/>
+      <w:r>
+        <w:t xml:space="preserve"> </w:t>
+      </w:r>
+      <w:proofErr w:type="spellStart"/>
+      <w:r>
+        <w:t>klasa</w:t>
+      </w:r>
+      <w:proofErr w:type="spellEnd"/>
+      <w:r>
+        <w:t xml:space="preserve"> (</w:t>
+      </w:r>
+      <w:proofErr w:type="spellStart"/>
+      <w:r>
+        <w:t>jer</w:t>
+      </w:r>
+      <w:proofErr w:type="spellEnd"/>
+      <w:r>
+        <w:t xml:space="preserve"> </w:t>
+      </w:r>
+      <w:proofErr w:type="spellStart"/>
+      <w:r>
+        <w:t>remiji</w:t>
+      </w:r>
+      <w:proofErr w:type="spellEnd"/>
+      <w:r>
+        <w:t xml:space="preserve"> </w:t>
+      </w:r>
+      <w:proofErr w:type="spellStart"/>
+      <w:r>
+        <w:t>dominiraju</w:t>
+      </w:r>
+      <w:proofErr w:type="spellEnd"/>
+      <w:r>
+        <w:t xml:space="preserve"> u </w:t>
+      </w:r>
+      <w:proofErr w:type="spellStart"/>
+      <w:r>
+        <w:t>nekim</w:t>
+      </w:r>
+      <w:proofErr w:type="spellEnd"/>
+      <w:r>
+        <w:t xml:space="preserve"> </w:t>
+      </w:r>
+      <w:proofErr w:type="spellStart"/>
+      <w:r>
+        <w:t>završnicama</w:t>
+      </w:r>
+      <w:proofErr w:type="spellEnd"/>
+      <w:r>
+        <w:t>),</w:t>
       </w:r>
     </w:p>
     <w:p>
@@ -489,7 +2099,15 @@
         </w:numPr>
       </w:pPr>
       <w:r>
-        <w:t>Podela na train (70%), validation (15%), test (15%).</w:t>
+        <w:t xml:space="preserve">Podela </w:t>
+      </w:r>
+      <w:proofErr w:type="spellStart"/>
+      <w:r>
+        <w:t>na</w:t>
+      </w:r>
+      <w:proofErr w:type="spellEnd"/>
+      <w:r>
+        <w:t xml:space="preserve"> train (70%), validation (15%), test (15%).</w:t>
       </w:r>
     </w:p>
     <w:p>
@@ -507,8 +2125,21 @@
       </w:r>
     </w:p>
     <w:p>
-      <w:r>
-        <w:t>Koraci rešavanja:</w:t>
+      <w:proofErr w:type="spellStart"/>
+      <w:r>
+        <w:t>Koraci</w:t>
+      </w:r>
+      <w:proofErr w:type="spellEnd"/>
+      <w:r>
+        <w:t xml:space="preserve"> </w:t>
+      </w:r>
+      <w:proofErr w:type="spellStart"/>
+      <w:r>
+        <w:t>rešavanja</w:t>
+      </w:r>
+      <w:proofErr w:type="spellEnd"/>
+      <w:r>
+        <w:t>:</w:t>
       </w:r>
     </w:p>
     <w:p>
@@ -519,13 +2150,31 @@
           <w:numId w:val="19"/>
         </w:numPr>
       </w:pPr>
+      <w:proofErr w:type="spellStart"/>
       <w:r>
         <w:rPr>
           <w:b/>
           <w:bCs/>
         </w:rPr>
-        <w:t>Ekstrakcija pozicija</w:t>
-      </w:r>
+        <w:t>Ekstrakcija</w:t>
+      </w:r>
+      <w:proofErr w:type="spellEnd"/>
+      <w:r>
+        <w:rPr>
+          <w:b/>
+          <w:bCs/>
+        </w:rPr>
+        <w:t xml:space="preserve"> </w:t>
+      </w:r>
+      <w:proofErr w:type="spellStart"/>
+      <w:r>
+        <w:rPr>
+          <w:b/>
+          <w:bCs/>
+        </w:rPr>
+        <w:t>pozicija</w:t>
+      </w:r>
+      <w:proofErr w:type="spellEnd"/>
       <w:r>
         <w:t xml:space="preserve"> → PGN → FEN.</w:t>
       </w:r>
@@ -538,6 +2187,7 @@
           <w:numId w:val="19"/>
         </w:numPr>
       </w:pPr>
+      <w:proofErr w:type="spellStart"/>
       <w:r>
         <w:rPr>
           <w:b/>
@@ -545,8 +2195,41 @@
         </w:rPr>
         <w:t>Pretprocesiranje</w:t>
       </w:r>
-      <w:r>
-        <w:t xml:space="preserve"> i obeležavanje tipova završnica.</w:t>
+      <w:proofErr w:type="spellEnd"/>
+      <w:r>
+        <w:t xml:space="preserve"> </w:t>
+      </w:r>
+      <w:proofErr w:type="spellStart"/>
+      <w:r>
+        <w:t>i</w:t>
+      </w:r>
+      <w:proofErr w:type="spellEnd"/>
+      <w:r>
+        <w:t xml:space="preserve"> </w:t>
+      </w:r>
+      <w:proofErr w:type="spellStart"/>
+      <w:r>
+        <w:t>obeležavanje</w:t>
+      </w:r>
+      <w:proofErr w:type="spellEnd"/>
+      <w:r>
+        <w:t xml:space="preserve"> </w:t>
+      </w:r>
+      <w:proofErr w:type="spellStart"/>
+      <w:r>
+        <w:t>tipova</w:t>
+      </w:r>
+      <w:proofErr w:type="spellEnd"/>
+      <w:r>
+        <w:t xml:space="preserve"> </w:t>
+      </w:r>
+      <w:proofErr w:type="spellStart"/>
+      <w:r>
+        <w:t>završnica</w:t>
+      </w:r>
+      <w:proofErr w:type="spellEnd"/>
+      <w:r>
+        <w:t>.</w:t>
       </w:r>
     </w:p>
     <w:p>
@@ -557,6 +2240,7 @@
           <w:numId w:val="19"/>
         </w:numPr>
       </w:pPr>
+      <w:proofErr w:type="spellStart"/>
       <w:r>
         <w:rPr>
           <w:b/>
@@ -564,6 +2248,7 @@
         </w:rPr>
         <w:t>Modelovanje</w:t>
       </w:r>
+      <w:proofErr w:type="spellEnd"/>
       <w:r>
         <w:t>:</w:t>
       </w:r>
@@ -577,7 +2262,55 @@
         </w:numPr>
       </w:pPr>
       <w:r>
-        <w:t>CNN/RNN za reprezentaciju šahovske table (kao slike ili matrice 8×8×N),</w:t>
+        <w:t xml:space="preserve">CNN/RNN za </w:t>
+      </w:r>
+      <w:proofErr w:type="spellStart"/>
+      <w:r>
+        <w:t>reprezentaciju</w:t>
+      </w:r>
+      <w:proofErr w:type="spellEnd"/>
+      <w:r>
+        <w:t xml:space="preserve"> </w:t>
+      </w:r>
+      <w:proofErr w:type="spellStart"/>
+      <w:r>
+        <w:t>šahovske</w:t>
+      </w:r>
+      <w:proofErr w:type="spellEnd"/>
+      <w:r>
+        <w:t xml:space="preserve"> table (</w:t>
+      </w:r>
+      <w:proofErr w:type="spellStart"/>
+      <w:r>
+        <w:t>kao</w:t>
+      </w:r>
+      <w:proofErr w:type="spellEnd"/>
+      <w:r>
+        <w:t xml:space="preserve"> </w:t>
+      </w:r>
+      <w:proofErr w:type="spellStart"/>
+      <w:r>
+        <w:t>slike</w:t>
+      </w:r>
+      <w:proofErr w:type="spellEnd"/>
+      <w:r>
+        <w:t xml:space="preserve"> </w:t>
+      </w:r>
+      <w:proofErr w:type="spellStart"/>
+      <w:r>
+        <w:t>ili</w:t>
+      </w:r>
+      <w:proofErr w:type="spellEnd"/>
+      <w:r>
+        <w:t xml:space="preserve"> </w:t>
+      </w:r>
+      <w:proofErr w:type="spellStart"/>
+      <w:r>
+        <w:t>matrice</w:t>
+      </w:r>
+      <w:proofErr w:type="spellEnd"/>
+      <w:r>
+        <w:t xml:space="preserve"> 8×8×N),</w:t>
       </w:r>
     </w:p>
     <w:p>
@@ -588,8 +2321,29 @@
           <w:numId w:val="11"/>
         </w:numPr>
       </w:pPr>
-      <w:r>
-        <w:t>klasifikacija tipa završnice,</w:t>
+      <w:proofErr w:type="spellStart"/>
+      <w:r>
+        <w:t>klasifikacija</w:t>
+      </w:r>
+      <w:proofErr w:type="spellEnd"/>
+      <w:r>
+        <w:t xml:space="preserve"> </w:t>
+      </w:r>
+      <w:proofErr w:type="spellStart"/>
+      <w:r>
+        <w:t>tipa</w:t>
+      </w:r>
+      <w:proofErr w:type="spellEnd"/>
+      <w:r>
+        <w:t xml:space="preserve"> </w:t>
+      </w:r>
+      <w:proofErr w:type="spellStart"/>
+      <w:r>
+        <w:t>završnice</w:t>
+      </w:r>
+      <w:proofErr w:type="spellEnd"/>
+      <w:r>
+        <w:t>,</w:t>
       </w:r>
     </w:p>
     <w:p>
@@ -600,8 +2354,45 @@
           <w:numId w:val="11"/>
         </w:numPr>
       </w:pPr>
-      <w:r>
-        <w:t>predikcija ishoda (pobeda/remi/poraz),</w:t>
+      <w:proofErr w:type="spellStart"/>
+      <w:r>
+        <w:t>predikcija</w:t>
+      </w:r>
+      <w:proofErr w:type="spellEnd"/>
+      <w:r>
+        <w:t xml:space="preserve"> </w:t>
+      </w:r>
+      <w:proofErr w:type="spellStart"/>
+      <w:r>
+        <w:t>ishoda</w:t>
+      </w:r>
+      <w:proofErr w:type="spellEnd"/>
+      <w:r>
+        <w:t xml:space="preserve"> (</w:t>
+      </w:r>
+      <w:proofErr w:type="spellStart"/>
+      <w:r>
+        <w:t>pobeda</w:t>
+      </w:r>
+      <w:proofErr w:type="spellEnd"/>
+      <w:r>
+        <w:t>/</w:t>
+      </w:r>
+      <w:proofErr w:type="spellStart"/>
+      <w:r>
+        <w:t>remi</w:t>
+      </w:r>
+      <w:proofErr w:type="spellEnd"/>
+      <w:r>
+        <w:t>/</w:t>
+      </w:r>
+      <w:proofErr w:type="spellStart"/>
+      <w:r>
+        <w:t>poraz</w:t>
+      </w:r>
+      <w:proofErr w:type="spellEnd"/>
+      <w:r>
+        <w:t>),</w:t>
       </w:r>
     </w:p>
     <w:p>
@@ -612,13 +2403,47 @@
           <w:numId w:val="19"/>
         </w:numPr>
       </w:pPr>
+      <w:proofErr w:type="spellStart"/>
       <w:r>
         <w:rPr>
           <w:b/>
           <w:bCs/>
         </w:rPr>
-        <w:t>Trening i evaluacija</w:t>
-      </w:r>
+        <w:t>Trening</w:t>
+      </w:r>
+      <w:proofErr w:type="spellEnd"/>
+      <w:r>
+        <w:rPr>
+          <w:b/>
+          <w:bCs/>
+        </w:rPr>
+        <w:t xml:space="preserve"> </w:t>
+      </w:r>
+      <w:proofErr w:type="spellStart"/>
+      <w:r>
+        <w:rPr>
+          <w:b/>
+          <w:bCs/>
+        </w:rPr>
+        <w:t>i</w:t>
+      </w:r>
+      <w:proofErr w:type="spellEnd"/>
+      <w:r>
+        <w:rPr>
+          <w:b/>
+          <w:bCs/>
+        </w:rPr>
+        <w:t xml:space="preserve"> </w:t>
+      </w:r>
+      <w:proofErr w:type="spellStart"/>
+      <w:r>
+        <w:rPr>
+          <w:b/>
+          <w:bCs/>
+        </w:rPr>
+        <w:t>evaluacija</w:t>
+      </w:r>
+      <w:proofErr w:type="spellEnd"/>
       <w:r>
         <w:t>.</w:t>
       </w:r>
@@ -631,15 +2456,105 @@
           <w:numId w:val="19"/>
         </w:numPr>
       </w:pPr>
+      <w:proofErr w:type="spellStart"/>
       <w:r>
         <w:rPr>
           <w:b/>
           <w:bCs/>
         </w:rPr>
-        <w:t>Izrada interfejsa</w:t>
-      </w:r>
-      <w:r>
-        <w:t xml:space="preserve"> – jednostavni tutor (unese se FEN pozicija → dobija se klasa završnice, evaluacija i savet).</w:t>
+        <w:t>Izrada</w:t>
+      </w:r>
+      <w:proofErr w:type="spellEnd"/>
+      <w:r>
+        <w:rPr>
+          <w:b/>
+          <w:bCs/>
+        </w:rPr>
+        <w:t xml:space="preserve"> </w:t>
+      </w:r>
+      <w:proofErr w:type="spellStart"/>
+      <w:r>
+        <w:rPr>
+          <w:b/>
+          <w:bCs/>
+        </w:rPr>
+        <w:t>interfejsa</w:t>
+      </w:r>
+      <w:proofErr w:type="spellEnd"/>
+      <w:r>
+        <w:t xml:space="preserve"> – </w:t>
+      </w:r>
+      <w:proofErr w:type="spellStart"/>
+      <w:r>
+        <w:t>jednostavni</w:t>
+      </w:r>
+      <w:proofErr w:type="spellEnd"/>
+      <w:r>
+        <w:t xml:space="preserve"> tutor (</w:t>
+      </w:r>
+      <w:proofErr w:type="spellStart"/>
+      <w:r>
+        <w:t>unese</w:t>
+      </w:r>
+      <w:proofErr w:type="spellEnd"/>
+      <w:r>
+        <w:t xml:space="preserve"> se FEN </w:t>
+      </w:r>
+      <w:proofErr w:type="spellStart"/>
+      <w:r>
+        <w:t>pozicija</w:t>
+      </w:r>
+      <w:proofErr w:type="spellEnd"/>
+      <w:r>
+        <w:t xml:space="preserve"> → </w:t>
+      </w:r>
+      <w:proofErr w:type="spellStart"/>
+      <w:r>
+        <w:t>dobija</w:t>
+      </w:r>
+      <w:proofErr w:type="spellEnd"/>
+      <w:r>
+        <w:t xml:space="preserve"> se </w:t>
+      </w:r>
+      <w:proofErr w:type="spellStart"/>
+      <w:r>
+        <w:t>klasa</w:t>
+      </w:r>
+      <w:proofErr w:type="spellEnd"/>
+      <w:r>
+        <w:t xml:space="preserve"> </w:t>
+      </w:r>
+      <w:proofErr w:type="spellStart"/>
+      <w:r>
+        <w:t>završnice</w:t>
+      </w:r>
+      <w:proofErr w:type="spellEnd"/>
+      <w:r>
+        <w:t xml:space="preserve">, </w:t>
+      </w:r>
+      <w:proofErr w:type="spellStart"/>
+      <w:r>
+        <w:t>evaluacija</w:t>
+      </w:r>
+      <w:proofErr w:type="spellEnd"/>
+      <w:r>
+        <w:t xml:space="preserve"> </w:t>
+      </w:r>
+      <w:proofErr w:type="spellStart"/>
+      <w:r>
+        <w:t>i</w:t>
+      </w:r>
+      <w:proofErr w:type="spellEnd"/>
+      <w:r>
+        <w:t xml:space="preserve"> </w:t>
+      </w:r>
+      <w:proofErr w:type="spellStart"/>
+      <w:r>
+        <w:t>savet</w:t>
+      </w:r>
+      <w:proofErr w:type="spellEnd"/>
+      <w:r>
+        <w:t>).</w:t>
       </w:r>
     </w:p>
     <w:p>
@@ -743,7 +2658,15 @@
         </w:numPr>
       </w:pPr>
       <w:r>
-        <w:t xml:space="preserve">Podela na </w:t>
+        <w:t xml:space="preserve">Podela </w:t>
+      </w:r>
+      <w:proofErr w:type="spellStart"/>
+      <w:r>
+        <w:t>na</w:t>
+      </w:r>
+      <w:proofErr w:type="spellEnd"/>
+      <w:r>
+        <w:t xml:space="preserve"> </w:t>
       </w:r>
       <w:r>
         <w:rPr>
@@ -753,7 +2676,15 @@
         <w:t>train/validation/test</w:t>
       </w:r>
       <w:r>
-        <w:t xml:space="preserve"> skupove,</w:t>
+        <w:t xml:space="preserve"> </w:t>
+      </w:r>
+      <w:proofErr w:type="spellStart"/>
+      <w:r>
+        <w:t>skupove</w:t>
+      </w:r>
+      <w:proofErr w:type="spellEnd"/>
+      <w:r>
+        <w:t>,</w:t>
       </w:r>
     </w:p>
     <w:p>
@@ -764,8 +2695,13 @@
           <w:numId w:val="14"/>
         </w:numPr>
       </w:pPr>
-      <w:r>
-        <w:t>Metrike:</w:t>
+      <w:proofErr w:type="spellStart"/>
+      <w:r>
+        <w:t>Metrike</w:t>
+      </w:r>
+      <w:proofErr w:type="spellEnd"/>
+      <w:r>
+        <w:t>:</w:t>
       </w:r>
     </w:p>
     <w:p>
@@ -775,8 +2711,29 @@
           <w:numId w:val="12"/>
         </w:numPr>
       </w:pPr>
-      <w:r>
-        <w:t>tačnost (za klasifikaciju završnica),</w:t>
+      <w:proofErr w:type="spellStart"/>
+      <w:r>
+        <w:t>tačnost</w:t>
+      </w:r>
+      <w:proofErr w:type="spellEnd"/>
+      <w:r>
+        <w:t xml:space="preserve"> (za </w:t>
+      </w:r>
+      <w:proofErr w:type="spellStart"/>
+      <w:r>
+        <w:t>klasifikaciju</w:t>
+      </w:r>
+      <w:proofErr w:type="spellEnd"/>
+      <w:r>
+        <w:t xml:space="preserve"> </w:t>
+      </w:r>
+      <w:proofErr w:type="spellStart"/>
+      <w:r>
+        <w:t>završnica</w:t>
+      </w:r>
+      <w:proofErr w:type="spellEnd"/>
+      <w:r>
+        <w:t>),</w:t>
       </w:r>
     </w:p>
     <w:p>
@@ -788,7 +2745,55 @@
       </w:pPr>
       <w:r>
         <w:lastRenderedPageBreak/>
-        <w:t>F1-score (za ishode, da bismo izbegli pristrasnost ka većinskoj klasi),</w:t>
+        <w:t xml:space="preserve">F1-score (za </w:t>
+      </w:r>
+      <w:proofErr w:type="spellStart"/>
+      <w:r>
+        <w:t>ishode</w:t>
+      </w:r>
+      <w:proofErr w:type="spellEnd"/>
+      <w:r>
+        <w:t xml:space="preserve">, da </w:t>
+      </w:r>
+      <w:proofErr w:type="spellStart"/>
+      <w:r>
+        <w:t>bismo</w:t>
+      </w:r>
+      <w:proofErr w:type="spellEnd"/>
+      <w:r>
+        <w:t xml:space="preserve"> </w:t>
+      </w:r>
+      <w:proofErr w:type="spellStart"/>
+      <w:r>
+        <w:t>izbegli</w:t>
+      </w:r>
+      <w:proofErr w:type="spellEnd"/>
+      <w:r>
+        <w:t xml:space="preserve"> </w:t>
+      </w:r>
+      <w:proofErr w:type="spellStart"/>
+      <w:r>
+        <w:t>pristrasnost</w:t>
+      </w:r>
+      <w:proofErr w:type="spellEnd"/>
+      <w:r>
+        <w:t xml:space="preserve"> ka </w:t>
+      </w:r>
+      <w:proofErr w:type="spellStart"/>
+      <w:r>
+        <w:t>većinskoj</w:t>
+      </w:r>
+      <w:proofErr w:type="spellEnd"/>
+      <w:r>
+        <w:t xml:space="preserve"> </w:t>
+      </w:r>
+      <w:proofErr w:type="spellStart"/>
+      <w:r>
+        <w:t>klasi</w:t>
+      </w:r>
+      <w:proofErr w:type="spellEnd"/>
+      <w:r>
+        <w:t>),</w:t>
       </w:r>
     </w:p>
     <w:p>
@@ -798,8 +2803,50 @@
           <w:numId w:val="12"/>
         </w:numPr>
       </w:pPr>
-      <w:r>
-        <w:t>eventualno poređenje sa „ground-truth“ iz tablebase-a.</w:t>
+      <w:proofErr w:type="spellStart"/>
+      <w:r>
+        <w:t>eventualno</w:t>
+      </w:r>
+      <w:proofErr w:type="spellEnd"/>
+      <w:r>
+        <w:t xml:space="preserve"> </w:t>
+      </w:r>
+      <w:proofErr w:type="spellStart"/>
+      <w:r>
+        <w:t>poređenje</w:t>
+      </w:r>
+      <w:proofErr w:type="spellEnd"/>
+      <w:r>
+        <w:t xml:space="preserve"> </w:t>
+      </w:r>
+      <w:proofErr w:type="spellStart"/>
+      <w:r>
+        <w:t>sa</w:t>
+      </w:r>
+      <w:proofErr w:type="spellEnd"/>
+      <w:r>
+        <w:t xml:space="preserve"> „ground-</w:t>
+      </w:r>
+      <w:proofErr w:type="gramStart"/>
+      <w:r>
+        <w:t xml:space="preserve">truth“ </w:t>
+      </w:r>
+      <w:proofErr w:type="spellStart"/>
+      <w:r>
+        <w:t>iz</w:t>
+      </w:r>
+      <w:proofErr w:type="spellEnd"/>
+      <w:proofErr w:type="gramEnd"/>
+      <w:r>
+        <w:t xml:space="preserve"> </w:t>
+      </w:r>
+      <w:proofErr w:type="spellStart"/>
+      <w:r>
+        <w:t>tablebase</w:t>
+      </w:r>
+      <w:proofErr w:type="spellEnd"/>
+      <w:r>
+        <w:t>-a.</w:t>
       </w:r>
     </w:p>
     <w:p>
@@ -850,8 +2897,17 @@
         <w:t>scikit-learn</w:t>
       </w:r>
       <w:r>
-        <w:t xml:space="preserve"> i </w:t>
-      </w:r>
+        <w:t xml:space="preserve"> </w:t>
+      </w:r>
+      <w:proofErr w:type="spellStart"/>
+      <w:r>
+        <w:t>i</w:t>
+      </w:r>
+      <w:proofErr w:type="spellEnd"/>
+      <w:r>
+        <w:t xml:space="preserve"> </w:t>
+      </w:r>
+      <w:proofErr w:type="spellStart"/>
       <w:r>
         <w:rPr>
           <w:b/>
@@ -859,8 +2915,33 @@
         </w:rPr>
         <w:t>PyTorch</w:t>
       </w:r>
-      <w:r>
-        <w:t xml:space="preserve"> (za klasifikaciju i predikciju)</w:t>
+      <w:proofErr w:type="spellEnd"/>
+      <w:r>
+        <w:t xml:space="preserve"> (za </w:t>
+      </w:r>
+      <w:proofErr w:type="spellStart"/>
+      <w:r>
+        <w:t>klasifikaciju</w:t>
+      </w:r>
+      <w:proofErr w:type="spellEnd"/>
+      <w:r>
+        <w:t xml:space="preserve"> </w:t>
+      </w:r>
+      <w:proofErr w:type="spellStart"/>
+      <w:r>
+        <w:t>i</w:t>
+      </w:r>
+      <w:proofErr w:type="spellEnd"/>
+      <w:r>
+        <w:t xml:space="preserve"> </w:t>
+      </w:r>
+      <w:proofErr w:type="spellStart"/>
+      <w:r>
+        <w:t>predikciju</w:t>
+      </w:r>
+      <w:proofErr w:type="spellEnd"/>
+      <w:r>
+        <w:t>)</w:t>
       </w:r>
     </w:p>
     <w:p>
@@ -880,7 +2961,23 @@
         <w:t>python-chess</w:t>
       </w:r>
       <w:r>
-        <w:t xml:space="preserve"> biblioteka (https://python-chess.readthedocs.io/) za rad sa FEN/PGN</w:t>
+        <w:t xml:space="preserve"> </w:t>
+      </w:r>
+      <w:proofErr w:type="spellStart"/>
+      <w:r>
+        <w:t>biblioteka</w:t>
+      </w:r>
+      <w:proofErr w:type="spellEnd"/>
+      <w:r>
+        <w:t xml:space="preserve"> (https://python-chess.readthedocs.io/) za rad </w:t>
+      </w:r>
+      <w:proofErr w:type="spellStart"/>
+      <w:r>
+        <w:t>sa</w:t>
+      </w:r>
+      <w:proofErr w:type="spellEnd"/>
+      <w:r>
+        <w:t xml:space="preserve"> FEN/PGN</w:t>
       </w:r>
     </w:p>
     <w:p>
@@ -896,23 +2993,45 @@
           <w:bCs/>
         </w:rPr>
       </w:pPr>
+      <w:proofErr w:type="spellStart"/>
       <w:r>
         <w:rPr>
           <w:b/>
           <w:bCs/>
         </w:rPr>
-        <w:t>pgn-extract</w:t>
-      </w:r>
+        <w:t>pgn</w:t>
+      </w:r>
+      <w:proofErr w:type="spellEnd"/>
       <w:r>
         <w:rPr>
           <w:b/>
           <w:bCs/>
         </w:rPr>
-        <w:t xml:space="preserve"> </w:t>
-      </w:r>
-      <w:r>
-        <w:t>za izdvajanje podataka</w:t>
-      </w:r>
+        <w:t>-extract</w:t>
+      </w:r>
+      <w:r>
+        <w:rPr>
+          <w:b/>
+          <w:bCs/>
+        </w:rPr>
+        <w:t xml:space="preserve"> </w:t>
+      </w:r>
+      <w:r>
+        <w:t xml:space="preserve">za </w:t>
+      </w:r>
+      <w:proofErr w:type="spellStart"/>
+      <w:r>
+        <w:t>izdvajanje</w:t>
+      </w:r>
+      <w:proofErr w:type="spellEnd"/>
+      <w:r>
+        <w:t xml:space="preserve"> </w:t>
+      </w:r>
+      <w:proofErr w:type="spellStart"/>
+      <w:r>
+        <w:t>podataka</w:t>
+      </w:r>
+      <w:proofErr w:type="spellEnd"/>
     </w:p>
     <w:p>
       <w:pPr>
@@ -931,8 +3050,21 @@
         <w:t>pandas, NumPy</w:t>
       </w:r>
       <w:r>
-        <w:t xml:space="preserve"> za rad sa podacima</w:t>
-      </w:r>
+        <w:t xml:space="preserve"> za rad </w:t>
+      </w:r>
+      <w:proofErr w:type="spellStart"/>
+      <w:r>
+        <w:t>sa</w:t>
+      </w:r>
+      <w:proofErr w:type="spellEnd"/>
+      <w:r>
+        <w:t xml:space="preserve"> </w:t>
+      </w:r>
+      <w:proofErr w:type="spellStart"/>
+      <w:r>
+        <w:t>podacima</w:t>
+      </w:r>
+      <w:proofErr w:type="spellEnd"/>
     </w:p>
     <w:p>
       <w:pPr>
@@ -951,23 +3083,145 @@
         <w:t>Matplotlib/Seaborn</w:t>
       </w:r>
       <w:r>
-        <w:t xml:space="preserve"> za vizualizacije</w:t>
-      </w:r>
+        <w:t xml:space="preserve"> za </w:t>
+      </w:r>
+      <w:proofErr w:type="spellStart"/>
+      <w:r>
+        <w:t>vizualizacije</w:t>
+      </w:r>
+      <w:proofErr w:type="spellEnd"/>
     </w:p>
     <w:p>
       <w:pPr>
         <w:ind w:left="360"/>
       </w:pPr>
       <w:r>
-        <w:t>Za obradu I anotaciju pozicija koristiće se python-chess biblioteka i alat pgn-extract, koji omogućavaju automatsko izdvajanje završnica iz PNG datoteka.</w:t>
+        <w:t xml:space="preserve">Za </w:t>
+      </w:r>
+      <w:proofErr w:type="spellStart"/>
+      <w:r>
+        <w:t>obradu</w:t>
+      </w:r>
+      <w:proofErr w:type="spellEnd"/>
+      <w:r>
+        <w:t xml:space="preserve"> I </w:t>
+      </w:r>
+      <w:proofErr w:type="spellStart"/>
+      <w:r>
+        <w:t>anotaciju</w:t>
+      </w:r>
+      <w:proofErr w:type="spellEnd"/>
+      <w:r>
+        <w:t xml:space="preserve"> </w:t>
+      </w:r>
+      <w:proofErr w:type="spellStart"/>
+      <w:r>
+        <w:t>pozicija</w:t>
+      </w:r>
+      <w:proofErr w:type="spellEnd"/>
+      <w:r>
+        <w:t xml:space="preserve"> </w:t>
+      </w:r>
+      <w:proofErr w:type="spellStart"/>
+      <w:r>
+        <w:t>koristiće</w:t>
+      </w:r>
+      <w:proofErr w:type="spellEnd"/>
+      <w:r>
+        <w:t xml:space="preserve"> se python-chess </w:t>
+      </w:r>
+      <w:proofErr w:type="spellStart"/>
+      <w:r>
+        <w:t>biblioteka</w:t>
+      </w:r>
+      <w:proofErr w:type="spellEnd"/>
+      <w:r>
+        <w:t xml:space="preserve"> </w:t>
+      </w:r>
+      <w:proofErr w:type="spellStart"/>
+      <w:r>
+        <w:t>i</w:t>
+      </w:r>
+      <w:proofErr w:type="spellEnd"/>
+      <w:r>
+        <w:t xml:space="preserve"> </w:t>
+      </w:r>
+      <w:proofErr w:type="spellStart"/>
+      <w:r>
+        <w:t>alat</w:t>
+      </w:r>
+      <w:proofErr w:type="spellEnd"/>
+      <w:r>
+        <w:t xml:space="preserve"> </w:t>
+      </w:r>
+      <w:proofErr w:type="spellStart"/>
+      <w:r>
+        <w:t>pgn</w:t>
+      </w:r>
+      <w:proofErr w:type="spellEnd"/>
+      <w:r>
+        <w:t xml:space="preserve">-extract, koji </w:t>
+      </w:r>
+      <w:proofErr w:type="spellStart"/>
+      <w:r>
+        <w:t>omogućavaju</w:t>
+      </w:r>
+      <w:proofErr w:type="spellEnd"/>
+      <w:r>
+        <w:t xml:space="preserve"> </w:t>
+      </w:r>
+      <w:proofErr w:type="spellStart"/>
+      <w:r>
+        <w:t>automatsko</w:t>
+      </w:r>
+      <w:proofErr w:type="spellEnd"/>
+      <w:r>
+        <w:t xml:space="preserve"> </w:t>
+      </w:r>
+      <w:proofErr w:type="spellStart"/>
+      <w:r>
+        <w:t>izdvajanje</w:t>
+      </w:r>
+      <w:proofErr w:type="spellEnd"/>
+      <w:r>
+        <w:t xml:space="preserve"> </w:t>
+      </w:r>
+      <w:proofErr w:type="spellStart"/>
+      <w:r>
+        <w:t>završnica</w:t>
+      </w:r>
+      <w:proofErr w:type="spellEnd"/>
+      <w:r>
+        <w:t xml:space="preserve"> </w:t>
+      </w:r>
+      <w:proofErr w:type="spellStart"/>
+      <w:r>
+        <w:t>iz</w:t>
+      </w:r>
+      <w:proofErr w:type="spellEnd"/>
+      <w:r>
+        <w:t xml:space="preserve"> PNG </w:t>
+      </w:r>
+      <w:proofErr w:type="spellStart"/>
+      <w:r>
+        <w:t>datoteka</w:t>
+      </w:r>
+      <w:proofErr w:type="spellEnd"/>
+      <w:r>
+        <w:t>.</w:t>
       </w:r>
     </w:p>
     <w:p>
       <w:pPr>
         <w:pStyle w:val="Heading3"/>
       </w:pPr>
-      <w:r>
-        <w:t>Relevantna literature</w:t>
+      <w:proofErr w:type="spellStart"/>
+      <w:r>
+        <w:t>Relevantna</w:t>
+      </w:r>
+      <w:proofErr w:type="spellEnd"/>
+      <w:r>
+        <w:t xml:space="preserve"> literature</w:t>
       </w:r>
     </w:p>
     <w:p>
@@ -978,8 +3232,13 @@
           <w:numId w:val="18"/>
         </w:numPr>
       </w:pPr>
-      <w:r>
-        <w:t xml:space="preserve">Lichess PGN database: </w:t>
+      <w:proofErr w:type="spellStart"/>
+      <w:r>
+        <w:t>Lichess</w:t>
+      </w:r>
+      <w:proofErr w:type="spellEnd"/>
+      <w:r>
+        <w:t xml:space="preserve"> PGN database: </w:t>
       </w:r>
       <w:hyperlink r:id="rId7" w:history="1">
         <w:r>
@@ -999,7 +3258,15 @@
         </w:numPr>
       </w:pPr>
       <w:r>
-        <w:t xml:space="preserve">Syzygy Endgame Tablebases: </w:t>
+        <w:t xml:space="preserve">Syzygy Endgame </w:t>
+      </w:r>
+      <w:proofErr w:type="spellStart"/>
+      <w:r>
+        <w:t>Tablebases</w:t>
+      </w:r>
+      <w:proofErr w:type="spellEnd"/>
+      <w:r>
+        <w:t xml:space="preserve">: </w:t>
       </w:r>
       <w:hyperlink r:id="rId8" w:history="1">
         <w:r>
@@ -1019,7 +3286,15 @@
         </w:numPr>
       </w:pPr>
       <w:r>
-        <w:t xml:space="preserve">Python-chess biblioteka: </w:t>
+        <w:t xml:space="preserve">Python-chess </w:t>
+      </w:r>
+      <w:proofErr w:type="spellStart"/>
+      <w:r>
+        <w:t>biblioteka</w:t>
+      </w:r>
+      <w:proofErr w:type="spellEnd"/>
+      <w:r>
+        <w:t xml:space="preserve">: </w:t>
       </w:r>
       <w:hyperlink r:id="rId9" w:history="1">
         <w:r>
@@ -1059,7 +3334,15 @@
         </w:numPr>
       </w:pPr>
       <w:r>
-        <w:t>Rad: "DeepChess: End-to-End Deep Neural Network for Automatic Learning in Chess" (</w:t>
+        <w:t>Rad: "</w:t>
+      </w:r>
+      <w:proofErr w:type="spellStart"/>
+      <w:r>
+        <w:t>DeepChess</w:t>
+      </w:r>
+      <w:proofErr w:type="spellEnd"/>
+      <w:r>
+        <w:t>: End-to-End Deep Neural Network for Automatic Learning in Chess" (</w:t>
       </w:r>
       <w:hyperlink r:id="rId11" w:history="1">
         <w:r>

</xml_diff>